<commit_message>
Remove old Acme Jobs schema
</commit_message>
<xml_diff>
--- a/reports/Task management.docx
+++ b/reports/Task management.docx
@@ -92,15 +92,6 @@
       <w:r>
         <w:t>2025-09-18: Creation of this report.</w:t>
       </w:r>
-    </w:p>
-    <w:p>
-      <w:pPr>
-        <w:pStyle w:val="ListParagraph"/>
-        <w:numPr>
-          <w:ilvl w:val="0"/>
-          <w:numId w:val="6"/>
-        </w:numPr>
-      </w:pPr>
     </w:p>
     <w:p>
       <w:pPr>
@@ -1093,6 +1084,544 @@
               </w:rPr>
             </w:pPr>
             <w:hyperlink r:id="rId13" w:history="1">
+              <w:r>
+                <w:rPr>
+                  <w:rStyle w:val="Hyperlink"/>
+                  <w:sz w:val="16"/>
+                  <w:szCs w:val="16"/>
+                </w:rPr>
+                <w:t>https://github.com/bloxio3001/Acme-C3-007/issues/8</w:t>
+              </w:r>
+            </w:hyperlink>
+          </w:p>
+        </w:tc>
+      </w:tr>
+      <w:tr>
+        <w:trPr>
+          <w:cnfStyle w:val="000000100000" w:firstRow="0" w:lastRow="0" w:firstColumn="0" w:lastColumn="0" w:oddVBand="0" w:evenVBand="0" w:oddHBand="1" w:evenHBand="0" w:firstRowFirstColumn="0" w:firstRowLastColumn="0" w:lastRowFirstColumn="0" w:lastRowLastColumn="0"/>
+        </w:trPr>
+        <w:tc>
+          <w:tcPr>
+            <w:cnfStyle w:val="001000000000" w:firstRow="0" w:lastRow="0" w:firstColumn="1" w:lastColumn="0" w:oddVBand="0" w:evenVBand="0" w:oddHBand="0" w:evenHBand="0" w:firstRowFirstColumn="0" w:firstRowLastColumn="0" w:lastRowFirstColumn="0" w:lastRowLastColumn="0"/>
+            <w:tcW w:w="900" w:type="dxa"/>
+          </w:tcPr>
+          <w:p>
+            <w:pPr>
+              <w:rPr>
+                <w:sz w:val="16"/>
+                <w:szCs w:val="16"/>
+              </w:rPr>
+            </w:pPr>
+            <w:r>
+              <w:rPr>
+                <w:b w:val="0"/>
+                <w:bCs w:val="0"/>
+                <w:sz w:val="16"/>
+                <w:szCs w:val="16"/>
+              </w:rPr>
+              <w:t>D02-00-0</w:t>
+            </w:r>
+            <w:r>
+              <w:rPr>
+                <w:b w:val="0"/>
+                <w:bCs w:val="0"/>
+                <w:sz w:val="16"/>
+                <w:szCs w:val="16"/>
+              </w:rPr>
+              <w:t>8</w:t>
+            </w:r>
+          </w:p>
+        </w:tc>
+        <w:tc>
+          <w:tcPr>
+            <w:tcW w:w="3409" w:type="dxa"/>
+          </w:tcPr>
+          <w:p>
+            <w:pPr>
+              <w:tabs>
+                <w:tab w:val="left" w:pos="900"/>
+              </w:tabs>
+              <w:cnfStyle w:val="000000100000" w:firstRow="0" w:lastRow="0" w:firstColumn="0" w:lastColumn="0" w:oddVBand="0" w:evenVBand="0" w:oddHBand="1" w:evenHBand="0" w:firstRowFirstColumn="0" w:firstRowLastColumn="0" w:lastRowFirstColumn="0" w:lastRowLastColumn="0"/>
+              <w:rPr>
+                <w:sz w:val="16"/>
+                <w:szCs w:val="16"/>
+              </w:rPr>
+            </w:pPr>
+            <w:r>
+              <w:rPr>
+                <w:sz w:val="16"/>
+                <w:szCs w:val="16"/>
+              </w:rPr>
+              <w:t>Declare</w:t>
+            </w:r>
+            <w:r>
+              <w:rPr>
+                <w:sz w:val="16"/>
+                <w:szCs w:val="16"/>
+              </w:rPr>
+              <w:t xml:space="preserve"> Review</w:t>
+            </w:r>
+            <w:r>
+              <w:rPr>
+                <w:sz w:val="16"/>
+                <w:szCs w:val="16"/>
+              </w:rPr>
+              <w:t xml:space="preserve"> entity</w:t>
+            </w:r>
+          </w:p>
+        </w:tc>
+        <w:tc>
+          <w:tcPr>
+            <w:tcW w:w="800" w:type="dxa"/>
+          </w:tcPr>
+          <w:p>
+            <w:pPr>
+              <w:jc w:val="center"/>
+              <w:cnfStyle w:val="000000100000" w:firstRow="0" w:lastRow="0" w:firstColumn="0" w:lastColumn="0" w:oddVBand="0" w:evenVBand="0" w:oddHBand="1" w:evenHBand="0" w:firstRowFirstColumn="0" w:firstRowLastColumn="0" w:lastRowFirstColumn="0" w:lastRowLastColumn="0"/>
+              <w:rPr>
+                <w:sz w:val="16"/>
+                <w:szCs w:val="16"/>
+              </w:rPr>
+            </w:pPr>
+            <w:r>
+              <w:rPr>
+                <w:sz w:val="16"/>
+                <w:szCs w:val="16"/>
+              </w:rPr>
+              <w:t>3</w:t>
+            </w:r>
+          </w:p>
+        </w:tc>
+        <w:tc>
+          <w:tcPr>
+            <w:tcW w:w="3729" w:type="dxa"/>
+          </w:tcPr>
+          <w:p>
+            <w:pPr>
+              <w:cnfStyle w:val="000000100000" w:firstRow="0" w:lastRow="0" w:firstColumn="0" w:lastColumn="0" w:oddVBand="0" w:evenVBand="0" w:oddHBand="1" w:evenHBand="0" w:firstRowFirstColumn="0" w:firstRowLastColumn="0" w:lastRowFirstColumn="0" w:lastRowLastColumn="0"/>
+            </w:pPr>
+            <w:hyperlink r:id="rId14" w:history="1">
+              <w:r>
+                <w:rPr>
+                  <w:rStyle w:val="Hyperlink"/>
+                  <w:sz w:val="16"/>
+                  <w:szCs w:val="16"/>
+                </w:rPr>
+                <w:t>https://github.com/bloxio3001/Acme-C3-007/issues/</w:t>
+              </w:r>
+            </w:hyperlink>
+            <w:r>
+              <w:rPr>
+                <w:rStyle w:val="Hyperlink"/>
+                <w:sz w:val="16"/>
+                <w:szCs w:val="16"/>
+              </w:rPr>
+              <w:t>9</w:t>
+            </w:r>
+          </w:p>
+        </w:tc>
+      </w:tr>
+      <w:tr>
+        <w:tc>
+          <w:tcPr>
+            <w:cnfStyle w:val="001000000000" w:firstRow="0" w:lastRow="0" w:firstColumn="1" w:lastColumn="0" w:oddVBand="0" w:evenVBand="0" w:oddHBand="0" w:evenHBand="0" w:firstRowFirstColumn="0" w:firstRowLastColumn="0" w:lastRowFirstColumn="0" w:lastRowLastColumn="0"/>
+            <w:tcW w:w="900" w:type="dxa"/>
+          </w:tcPr>
+          <w:p>
+            <w:pPr>
+              <w:rPr>
+                <w:sz w:val="16"/>
+                <w:szCs w:val="16"/>
+              </w:rPr>
+            </w:pPr>
+            <w:r>
+              <w:rPr>
+                <w:b w:val="0"/>
+                <w:bCs w:val="0"/>
+                <w:sz w:val="16"/>
+                <w:szCs w:val="16"/>
+              </w:rPr>
+              <w:t>D02-0</w:t>
+            </w:r>
+            <w:r>
+              <w:rPr>
+                <w:b w:val="0"/>
+                <w:bCs w:val="0"/>
+                <w:sz w:val="16"/>
+                <w:szCs w:val="16"/>
+              </w:rPr>
+              <w:t>1</w:t>
+            </w:r>
+            <w:r>
+              <w:rPr>
+                <w:b w:val="0"/>
+                <w:bCs w:val="0"/>
+                <w:sz w:val="16"/>
+                <w:szCs w:val="16"/>
+              </w:rPr>
+              <w:t>-0</w:t>
+            </w:r>
+            <w:r>
+              <w:rPr>
+                <w:b w:val="0"/>
+                <w:bCs w:val="0"/>
+                <w:sz w:val="16"/>
+                <w:szCs w:val="16"/>
+              </w:rPr>
+              <w:t>3</w:t>
+            </w:r>
+          </w:p>
+        </w:tc>
+        <w:tc>
+          <w:tcPr>
+            <w:tcW w:w="3409" w:type="dxa"/>
+          </w:tcPr>
+          <w:p>
+            <w:pPr>
+              <w:tabs>
+                <w:tab w:val="left" w:pos="900"/>
+              </w:tabs>
+              <w:cnfStyle w:val="000000000000" w:firstRow="0" w:lastRow="0" w:firstColumn="0" w:lastColumn="0" w:oddVBand="0" w:evenVBand="0" w:oddHBand="0" w:evenHBand="0" w:firstRowFirstColumn="0" w:firstRowLastColumn="0" w:lastRowFirstColumn="0" w:lastRowLastColumn="0"/>
+              <w:rPr>
+                <w:sz w:val="16"/>
+                <w:szCs w:val="16"/>
+              </w:rPr>
+            </w:pPr>
+            <w:r>
+              <w:rPr>
+                <w:sz w:val="16"/>
+                <w:szCs w:val="16"/>
+              </w:rPr>
+              <w:t>Declare</w:t>
+            </w:r>
+            <w:r>
+              <w:rPr>
+                <w:sz w:val="16"/>
+                <w:szCs w:val="16"/>
+              </w:rPr>
+              <w:t xml:space="preserve"> </w:t>
+            </w:r>
+            <w:r>
+              <w:rPr>
+                <w:sz w:val="16"/>
+                <w:szCs w:val="16"/>
+              </w:rPr>
+              <w:t xml:space="preserve">AirlineManager </w:t>
+            </w:r>
+            <w:r>
+              <w:rPr>
+                <w:sz w:val="16"/>
+                <w:szCs w:val="16"/>
+              </w:rPr>
+              <w:t>entity</w:t>
+            </w:r>
+          </w:p>
+        </w:tc>
+        <w:tc>
+          <w:tcPr>
+            <w:tcW w:w="800" w:type="dxa"/>
+          </w:tcPr>
+          <w:p>
+            <w:pPr>
+              <w:jc w:val="center"/>
+              <w:cnfStyle w:val="000000000000" w:firstRow="0" w:lastRow="0" w:firstColumn="0" w:lastColumn="0" w:oddVBand="0" w:evenVBand="0" w:oddHBand="0" w:evenHBand="0" w:firstRowFirstColumn="0" w:firstRowLastColumn="0" w:lastRowFirstColumn="0" w:lastRowLastColumn="0"/>
+              <w:rPr>
+                <w:sz w:val="16"/>
+                <w:szCs w:val="16"/>
+              </w:rPr>
+            </w:pPr>
+            <w:r>
+              <w:rPr>
+                <w:sz w:val="16"/>
+                <w:szCs w:val="16"/>
+              </w:rPr>
+              <w:t>3</w:t>
+            </w:r>
+          </w:p>
+        </w:tc>
+        <w:tc>
+          <w:tcPr>
+            <w:tcW w:w="3729" w:type="dxa"/>
+          </w:tcPr>
+          <w:p>
+            <w:pPr>
+              <w:cnfStyle w:val="000000000000" w:firstRow="0" w:lastRow="0" w:firstColumn="0" w:lastColumn="0" w:oddVBand="0" w:evenVBand="0" w:oddHBand="0" w:evenHBand="0" w:firstRowFirstColumn="0" w:firstRowLastColumn="0" w:lastRowFirstColumn="0" w:lastRowLastColumn="0"/>
+            </w:pPr>
+            <w:hyperlink r:id="rId15" w:history="1">
+              <w:r>
+                <w:rPr>
+                  <w:rStyle w:val="Hyperlink"/>
+                  <w:sz w:val="16"/>
+                  <w:szCs w:val="16"/>
+                </w:rPr>
+                <w:t>https://github.com/bloxio3001/Acme-C3-007/issues/8</w:t>
+              </w:r>
+            </w:hyperlink>
+          </w:p>
+        </w:tc>
+      </w:tr>
+      <w:tr>
+        <w:trPr>
+          <w:cnfStyle w:val="000000100000" w:firstRow="0" w:lastRow="0" w:firstColumn="0" w:lastColumn="0" w:oddVBand="0" w:evenVBand="0" w:oddHBand="1" w:evenHBand="0" w:firstRowFirstColumn="0" w:firstRowLastColumn="0" w:lastRowFirstColumn="0" w:lastRowLastColumn="0"/>
+        </w:trPr>
+        <w:tc>
+          <w:tcPr>
+            <w:cnfStyle w:val="001000000000" w:firstRow="0" w:lastRow="0" w:firstColumn="1" w:lastColumn="0" w:oddVBand="0" w:evenVBand="0" w:oddHBand="0" w:evenHBand="0" w:firstRowFirstColumn="0" w:firstRowLastColumn="0" w:lastRowFirstColumn="0" w:lastRowLastColumn="0"/>
+            <w:tcW w:w="900" w:type="dxa"/>
+          </w:tcPr>
+          <w:p>
+            <w:pPr>
+              <w:rPr>
+                <w:sz w:val="16"/>
+                <w:szCs w:val="16"/>
+              </w:rPr>
+            </w:pPr>
+            <w:r>
+              <w:rPr>
+                <w:b w:val="0"/>
+                <w:bCs w:val="0"/>
+                <w:sz w:val="16"/>
+                <w:szCs w:val="16"/>
+              </w:rPr>
+              <w:t>D02-0</w:t>
+            </w:r>
+            <w:r>
+              <w:rPr>
+                <w:b w:val="0"/>
+                <w:bCs w:val="0"/>
+                <w:sz w:val="16"/>
+                <w:szCs w:val="16"/>
+              </w:rPr>
+              <w:t>1</w:t>
+            </w:r>
+            <w:r>
+              <w:rPr>
+                <w:b w:val="0"/>
+                <w:bCs w:val="0"/>
+                <w:sz w:val="16"/>
+                <w:szCs w:val="16"/>
+              </w:rPr>
+              <w:t>-0</w:t>
+            </w:r>
+            <w:r>
+              <w:rPr>
+                <w:b w:val="0"/>
+                <w:bCs w:val="0"/>
+                <w:sz w:val="16"/>
+                <w:szCs w:val="16"/>
+              </w:rPr>
+              <w:t>4</w:t>
+            </w:r>
+          </w:p>
+        </w:tc>
+        <w:tc>
+          <w:tcPr>
+            <w:tcW w:w="3409" w:type="dxa"/>
+          </w:tcPr>
+          <w:p>
+            <w:pPr>
+              <w:tabs>
+                <w:tab w:val="left" w:pos="900"/>
+              </w:tabs>
+              <w:cnfStyle w:val="000000100000" w:firstRow="0" w:lastRow="0" w:firstColumn="0" w:lastColumn="0" w:oddVBand="0" w:evenVBand="0" w:oddHBand="1" w:evenHBand="0" w:firstRowFirstColumn="0" w:firstRowLastColumn="0" w:lastRowFirstColumn="0" w:lastRowLastColumn="0"/>
+              <w:rPr>
+                <w:sz w:val="16"/>
+                <w:szCs w:val="16"/>
+              </w:rPr>
+            </w:pPr>
+            <w:r>
+              <w:rPr>
+                <w:sz w:val="16"/>
+                <w:szCs w:val="16"/>
+              </w:rPr>
+              <w:t>Declare</w:t>
+            </w:r>
+            <w:r>
+              <w:rPr>
+                <w:sz w:val="16"/>
+                <w:szCs w:val="16"/>
+              </w:rPr>
+              <w:t xml:space="preserve"> </w:t>
+            </w:r>
+            <w:r>
+              <w:rPr>
+                <w:sz w:val="16"/>
+                <w:szCs w:val="16"/>
+              </w:rPr>
+              <w:t xml:space="preserve">Flight </w:t>
+            </w:r>
+            <w:r>
+              <w:rPr>
+                <w:sz w:val="16"/>
+                <w:szCs w:val="16"/>
+              </w:rPr>
+              <w:t>entity</w:t>
+            </w:r>
+          </w:p>
+        </w:tc>
+        <w:tc>
+          <w:tcPr>
+            <w:tcW w:w="800" w:type="dxa"/>
+          </w:tcPr>
+          <w:p>
+            <w:pPr>
+              <w:jc w:val="center"/>
+              <w:cnfStyle w:val="000000100000" w:firstRow="0" w:lastRow="0" w:firstColumn="0" w:lastColumn="0" w:oddVBand="0" w:evenVBand="0" w:oddHBand="1" w:evenHBand="0" w:firstRowFirstColumn="0" w:firstRowLastColumn="0" w:lastRowFirstColumn="0" w:lastRowLastColumn="0"/>
+              <w:rPr>
+                <w:sz w:val="16"/>
+                <w:szCs w:val="16"/>
+              </w:rPr>
+            </w:pPr>
+            <w:r>
+              <w:rPr>
+                <w:sz w:val="16"/>
+                <w:szCs w:val="16"/>
+              </w:rPr>
+              <w:t>3</w:t>
+            </w:r>
+          </w:p>
+        </w:tc>
+        <w:tc>
+          <w:tcPr>
+            <w:tcW w:w="3729" w:type="dxa"/>
+          </w:tcPr>
+          <w:p>
+            <w:pPr>
+              <w:cnfStyle w:val="000000100000" w:firstRow="0" w:lastRow="0" w:firstColumn="0" w:lastColumn="0" w:oddVBand="0" w:evenVBand="0" w:oddHBand="1" w:evenHBand="0" w:firstRowFirstColumn="0" w:firstRowLastColumn="0" w:lastRowFirstColumn="0" w:lastRowLastColumn="0"/>
+            </w:pPr>
+            <w:hyperlink r:id="rId16" w:history="1">
+              <w:r>
+                <w:rPr>
+                  <w:rStyle w:val="Hyperlink"/>
+                  <w:sz w:val="16"/>
+                  <w:szCs w:val="16"/>
+                </w:rPr>
+                <w:t>https://github.com/bloxio3001/Acme-C3-007/issues/8</w:t>
+              </w:r>
+            </w:hyperlink>
+          </w:p>
+        </w:tc>
+      </w:tr>
+      <w:tr>
+        <w:tc>
+          <w:tcPr>
+            <w:cnfStyle w:val="001000000000" w:firstRow="0" w:lastRow="0" w:firstColumn="1" w:lastColumn="0" w:oddVBand="0" w:evenVBand="0" w:oddHBand="0" w:evenHBand="0" w:firstRowFirstColumn="0" w:firstRowLastColumn="0" w:lastRowFirstColumn="0" w:lastRowLastColumn="0"/>
+            <w:tcW w:w="900" w:type="dxa"/>
+          </w:tcPr>
+          <w:p>
+            <w:pPr>
+              <w:rPr>
+                <w:sz w:val="16"/>
+                <w:szCs w:val="16"/>
+              </w:rPr>
+            </w:pPr>
+            <w:r>
+              <w:rPr>
+                <w:b w:val="0"/>
+                <w:bCs w:val="0"/>
+                <w:sz w:val="16"/>
+                <w:szCs w:val="16"/>
+              </w:rPr>
+              <w:t>D02-0</w:t>
+            </w:r>
+            <w:r>
+              <w:rPr>
+                <w:b w:val="0"/>
+                <w:bCs w:val="0"/>
+                <w:sz w:val="16"/>
+                <w:szCs w:val="16"/>
+              </w:rPr>
+              <w:t>1</w:t>
+            </w:r>
+            <w:r>
+              <w:rPr>
+                <w:b w:val="0"/>
+                <w:bCs w:val="0"/>
+                <w:sz w:val="16"/>
+                <w:szCs w:val="16"/>
+              </w:rPr>
+              <w:t>-0</w:t>
+            </w:r>
+            <w:r>
+              <w:rPr>
+                <w:b w:val="0"/>
+                <w:bCs w:val="0"/>
+                <w:sz w:val="16"/>
+                <w:szCs w:val="16"/>
+              </w:rPr>
+              <w:t>5</w:t>
+            </w:r>
+          </w:p>
+        </w:tc>
+        <w:tc>
+          <w:tcPr>
+            <w:tcW w:w="3409" w:type="dxa"/>
+          </w:tcPr>
+          <w:p>
+            <w:pPr>
+              <w:tabs>
+                <w:tab w:val="left" w:pos="900"/>
+              </w:tabs>
+              <w:cnfStyle w:val="000000000000" w:firstRow="0" w:lastRow="0" w:firstColumn="0" w:lastColumn="0" w:oddVBand="0" w:evenVBand="0" w:oddHBand="0" w:evenHBand="0" w:firstRowFirstColumn="0" w:firstRowLastColumn="0" w:lastRowFirstColumn="0" w:lastRowLastColumn="0"/>
+              <w:rPr>
+                <w:sz w:val="16"/>
+                <w:szCs w:val="16"/>
+              </w:rPr>
+            </w:pPr>
+            <w:r>
+              <w:rPr>
+                <w:sz w:val="16"/>
+                <w:szCs w:val="16"/>
+              </w:rPr>
+              <w:t>Declare</w:t>
+            </w:r>
+            <w:r>
+              <w:rPr>
+                <w:sz w:val="16"/>
+                <w:szCs w:val="16"/>
+              </w:rPr>
+              <w:t xml:space="preserve"> Leg</w:t>
+            </w:r>
+            <w:r>
+              <w:rPr>
+                <w:sz w:val="16"/>
+                <w:szCs w:val="16"/>
+              </w:rPr>
+              <w:t xml:space="preserve"> entity</w:t>
+            </w:r>
+          </w:p>
+        </w:tc>
+        <w:tc>
+          <w:tcPr>
+            <w:tcW w:w="800" w:type="dxa"/>
+          </w:tcPr>
+          <w:p>
+            <w:pPr>
+              <w:jc w:val="center"/>
+              <w:cnfStyle w:val="000000000000" w:firstRow="0" w:lastRow="0" w:firstColumn="0" w:lastColumn="0" w:oddVBand="0" w:evenVBand="0" w:oddHBand="0" w:evenHBand="0" w:firstRowFirstColumn="0" w:firstRowLastColumn="0" w:lastRowFirstColumn="0" w:lastRowLastColumn="0"/>
+              <w:rPr>
+                <w:sz w:val="16"/>
+                <w:szCs w:val="16"/>
+              </w:rPr>
+            </w:pPr>
+            <w:r>
+              <w:rPr>
+                <w:sz w:val="16"/>
+                <w:szCs w:val="16"/>
+              </w:rPr>
+              <w:t>3</w:t>
+            </w:r>
+          </w:p>
+        </w:tc>
+        <w:tc>
+          <w:tcPr>
+            <w:tcW w:w="3729" w:type="dxa"/>
+          </w:tcPr>
+          <w:p>
+            <w:pPr>
+              <w:cnfStyle w:val="000000000000" w:firstRow="0" w:lastRow="0" w:firstColumn="0" w:lastColumn="0" w:oddVBand="0" w:evenVBand="0" w:oddHBand="0" w:evenHBand="0" w:firstRowFirstColumn="0" w:firstRowLastColumn="0" w:lastRowFirstColumn="0" w:lastRowLastColumn="0"/>
+            </w:pPr>
+            <w:hyperlink r:id="rId17" w:history="1">
               <w:r>
                 <w:rPr>
                   <w:rStyle w:val="Hyperlink"/>

</xml_diff>